<commit_message>
Ribbon body 96 px on every tab (three rows at most, compact galleries); Normal template headings in hunter green
Co-Authored-By: Claude Opus 5.5 <noreply@anthropic.com>
Claude-Session: https://claude.ai/code/session_01L7oDhePMuTSzKAPokorihB
</commit_message>
<xml_diff>
--- a/share/templates/Normal-A4.docx
+++ b/share/templates/Normal-A4.docx
@@ -50,7 +50,7 @@
     </w:pPr>
     <w:rPr>
       <w:rFonts w:asciiTheme="majorHAnsi" w:eastAsiaTheme="majorEastAsia" w:hAnsiTheme="majorHAnsi" w:cstheme="majorBidi"/>
-      <w:color w:val="2F5496"/>
+      <w:color w:val="2E6B3F"/>
       <w:sz w:val="32"/>
       <w:szCs w:val="32"/>
     </w:rPr>
@@ -62,7 +62,7 @@
     <w:uiPriority w:val="9"/>
     <w:rPr>
       <w:rFonts w:asciiTheme="majorHAnsi" w:eastAsiaTheme="majorEastAsia" w:hAnsiTheme="majorHAnsi" w:cstheme="majorBidi"/>
-      <w:color w:val="2F5496"/>
+      <w:color w:val="2E6B3F"/>
       <w:sz w:val="32"/>
       <w:szCs w:val="32"/>
     </w:rPr>
@@ -82,7 +82,7 @@
     </w:pPr>
     <w:rPr>
       <w:rFonts w:asciiTheme="majorHAnsi" w:eastAsiaTheme="majorEastAsia" w:hAnsiTheme="majorHAnsi" w:cstheme="majorBidi"/>
-      <w:color w:val="2F5496"/>
+      <w:color w:val="2E6B3F"/>
       <w:sz w:val="26"/>
       <w:szCs w:val="26"/>
     </w:rPr>
@@ -94,7 +94,7 @@
     <w:uiPriority w:val="9"/>
     <w:rPr>
       <w:rFonts w:asciiTheme="majorHAnsi" w:eastAsiaTheme="majorEastAsia" w:hAnsiTheme="majorHAnsi" w:cstheme="majorBidi"/>
-      <w:color w:val="2F5496"/>
+      <w:color w:val="2E6B3F"/>
       <w:sz w:val="26"/>
       <w:szCs w:val="26"/>
     </w:rPr>
@@ -114,7 +114,7 @@
     </w:pPr>
     <w:rPr>
       <w:rFonts w:asciiTheme="majorHAnsi" w:eastAsiaTheme="majorEastAsia" w:hAnsiTheme="majorHAnsi" w:cstheme="majorBidi"/>
-      <w:color w:val="1F3763"/>
+      <w:color w:val="1F4D2C"/>
       <w:sz w:val="24"/>
       <w:szCs w:val="24"/>
     </w:rPr>
@@ -126,7 +126,7 @@
     <w:uiPriority w:val="9"/>
     <w:rPr>
       <w:rFonts w:asciiTheme="majorHAnsi" w:eastAsiaTheme="majorEastAsia" w:hAnsiTheme="majorHAnsi" w:cstheme="majorBidi"/>
-      <w:color w:val="1F3763"/>
+      <w:color w:val="1F4D2C"/>
       <w:sz w:val="24"/>
       <w:szCs w:val="24"/>
     </w:rPr>
@@ -148,7 +148,7 @@
       <w:rFonts w:asciiTheme="majorHAnsi" w:eastAsiaTheme="majorEastAsia" w:hAnsiTheme="majorHAnsi" w:cstheme="majorBidi"/>
       <w:i/>
       <w:iCs/>
-      <w:color w:val="2F5496"/>
+      <w:color w:val="2E6B3F"/>
     </w:rPr>
   </w:style>
   <w:style w:type="character" w:styleId="Heading4Char">
@@ -160,7 +160,7 @@
       <w:rFonts w:asciiTheme="majorHAnsi" w:eastAsiaTheme="majorEastAsia" w:hAnsiTheme="majorHAnsi" w:cstheme="majorBidi"/>
       <w:i/>
       <w:iCs/>
-      <w:color w:val="2F5496"/>
+      <w:color w:val="2E6B3F"/>
     </w:rPr>
   </w:style>
   <w:style w:type="paragraph" w:styleId="Heading5">
@@ -178,7 +178,7 @@
     </w:pPr>
     <w:rPr>
       <w:rFonts w:asciiTheme="majorHAnsi" w:eastAsiaTheme="majorEastAsia" w:hAnsiTheme="majorHAnsi" w:cstheme="majorBidi"/>
-      <w:color w:val="2F5496"/>
+      <w:color w:val="2E6B3F"/>
     </w:rPr>
   </w:style>
   <w:style w:type="character" w:styleId="Heading5Char">
@@ -188,7 +188,7 @@
     <w:uiPriority w:val="9"/>
     <w:rPr>
       <w:rFonts w:asciiTheme="majorHAnsi" w:eastAsiaTheme="majorEastAsia" w:hAnsiTheme="majorHAnsi" w:cstheme="majorBidi"/>
-      <w:color w:val="2F5496"/>
+      <w:color w:val="2E6B3F"/>
     </w:rPr>
   </w:style>
   <w:style w:type="paragraph" w:styleId="Heading6">
@@ -206,7 +206,7 @@
     </w:pPr>
     <w:rPr>
       <w:rFonts w:asciiTheme="majorHAnsi" w:eastAsiaTheme="majorEastAsia" w:hAnsiTheme="majorHAnsi" w:cstheme="majorBidi"/>
-      <w:color w:val="1F3763"/>
+      <w:color w:val="1F4D2C"/>
     </w:rPr>
   </w:style>
   <w:style w:type="character" w:styleId="Heading6Char">
@@ -216,7 +216,7 @@
     <w:uiPriority w:val="9"/>
     <w:rPr>
       <w:rFonts w:asciiTheme="majorHAnsi" w:eastAsiaTheme="majorEastAsia" w:hAnsiTheme="majorHAnsi" w:cstheme="majorBidi"/>
-      <w:color w:val="1F3763"/>
+      <w:color w:val="1F4D2C"/>
     </w:rPr>
   </w:style>
   <w:style w:type="paragraph" w:styleId="Heading7">
@@ -236,7 +236,7 @@
       <w:rFonts w:asciiTheme="majorHAnsi" w:eastAsiaTheme="majorEastAsia" w:hAnsiTheme="majorHAnsi" w:cstheme="majorBidi"/>
       <w:i/>
       <w:iCs/>
-      <w:color w:val="1F3763"/>
+      <w:color w:val="1F4D2C"/>
     </w:rPr>
   </w:style>
   <w:style w:type="character" w:styleId="Heading7Char">
@@ -248,7 +248,7 @@
       <w:rFonts w:asciiTheme="majorHAnsi" w:eastAsiaTheme="majorEastAsia" w:hAnsiTheme="majorHAnsi" w:cstheme="majorBidi"/>
       <w:i/>
       <w:iCs/>
-      <w:color w:val="1F3763"/>
+      <w:color w:val="1F4D2C"/>
     </w:rPr>
   </w:style>
   <w:style w:type="paragraph" w:styleId="Heading8">

</xml_diff>